<commit_message>
Statement paragraph 6: the Filer is not the registered agent; FLORIDA PROTECTED SERIES, LLC - PS 2, a separate series, is. Order card reads 'Sent to the Division on [date]' once the button is pressed
Co-Authored-By: Claude Fable 5.1 <noreply@anthropic.com>
</commit_message>
<xml_diff>
--- a/docs/word/FPSLLC Statement of Authorized Representative - FORM.docx
+++ b/docs/word/FPSLLC Statement of Authorized Representative - FORM.docx
@@ -278,7 +278,24 @@
           <w:sz w:val="24"/>
           <w:szCs w:val="24"/>
         </w:rPr>
-        <w:t xml:space="preserve"> If the Company has separately engaged the Filer or its affiliate as registered agent, that engagement is a distinct service governed by its own terms and by s. 605.0113, Florida Statutes, and nothing in this Statement affects it.</w:t>
+        <w:t xml:space="preserve"> The Filer is not the Company's registered agent. If the Company has engaged </w:t>
+      </w:r>
+      <w:r>
+        <w:rPr>
+          <w:rFonts w:ascii="Times New Roman" w:hAnsi="Times New Roman"/>
+          <w:b/>
+          <w:sz w:val="24"/>
+          <w:szCs w:val="24"/>
+        </w:rPr>
+        <w:t xml:space="preserve">FLORIDA PROTECTED SERIES, LLC - PS 2</w:t>
+      </w:r>
+      <w:r>
+        <w:rPr>
+          <w:rFonts w:ascii="Times New Roman" w:hAnsi="Times New Roman"/>
+          <w:sz w:val="24"/>
+          <w:szCs w:val="24"/>
+        </w:rPr>
+        <w:t xml:space="preserve">, a separate protected series of the same limited liability company, as its registered agent, that engagement is a distinct service governed by its own terms and by s. 605.0113, Florida Statutes, and nothing in this Statement affects it.</w:t>
       </w:r>
     </w:p>
     <w:p>

</xml_diff>